<commit_message>
docs: update stage 3 deliverables
</commit_message>
<xml_diff>
--- a/reports/第二阶段实验报告.docx
+++ b/reports/第二阶段实验报告.docx
@@ -571,10 +571,7 @@
           </w:tcPr>
           <w:p>
             <w:r>
-              <w:rPr>
-                <w:sz w:val="18"/>
-              </w:rPr>
-              <w:t>77,439 行，178 列</w:t>
+              <w:t>74,132 行，169 列</w:t>
             </w:r>
           </w:p>
         </w:tc>
@@ -612,10 +609,7 @@
           </w:tcPr>
           <w:p>
             <w:r>
-              <w:rPr>
-                <w:sz w:val="18"/>
-              </w:rPr>
-              <w:t>22,126 行，178 列</w:t>
+              <w:t>18,628 行，169 列</w:t>
             </w:r>
           </w:p>
         </w:tc>
@@ -653,10 +647,7 @@
           </w:tcPr>
           <w:p>
             <w:r>
-              <w:rPr>
-                <w:sz w:val="18"/>
-              </w:rPr>
-              <w:t>11,063 行，178 列</w:t>
+              <w:t>17,868 行，169 列</w:t>
             </w:r>
           </w:p>
         </w:tc>
@@ -2222,50 +2213,7 @@
         </w:rPr>
       </w:pPr>
       <w:r>
-        <w:rPr>
-          <w:lang w:eastAsia="zh-CN"/>
-        </w:rPr>
-        <w:t>特征预处理先</w:t>
-      </w:r>
-      <w:r>
-        <w:rPr>
-          <w:rFonts w:hint="eastAsia"/>
-          <w:lang w:eastAsia="zh-CN"/>
-        </w:rPr>
-        <w:t>使用随即划分的方法</w:t>
-      </w:r>
-      <w:r>
-        <w:rPr>
-          <w:lang w:eastAsia="zh-CN"/>
-        </w:rPr>
-        <w:t>按 7:2:1 划分训练集、验证集和测试集</w:t>
-      </w:r>
-      <w:r>
-        <w:rPr>
-          <w:rFonts w:hint="eastAsia"/>
-          <w:lang w:eastAsia="zh-CN"/>
-        </w:rPr>
-        <w:t>（seed=</w:t>
-      </w:r>
-      <w:r>
-        <w:rPr>
-          <w:rFonts w:hint="eastAsia"/>
-          <w:lang w:eastAsia="zh-CN"/>
-        </w:rPr>
-        <w:t>42</w:t>
-      </w:r>
-      <w:r>
-        <w:rPr>
-          <w:rFonts w:hint="eastAsia"/>
-          <w:lang w:eastAsia="zh-CN"/>
-        </w:rPr>
-        <w:t>）</w:t>
-      </w:r>
-      <w:r>
-        <w:rPr>
-          <w:lang w:eastAsia="zh-CN"/>
-        </w:rPr>
-        <w:t>，再在训练集上学习编码和标准化规则，并将同一规则应用到验证集和测试集，避免在预处理阶段泄露验证集或测试集信息。</w:t>
+        <w:t>特征预处理改为按 arrival_date 的时间窗口划分数据：2024 年 1-8 月为训练集，9-10 月为验证集，11-12 月为测试集。类别编码、数值标准化和特征有效性预评估仍然只在训练集上学习规则，再应用到验证集和测试集，从而更接近“使用历史月份预测未来月份”的业务场景。</w:t>
       </w:r>
     </w:p>
     <w:tbl>
@@ -2356,10 +2304,7 @@
           </w:tcPr>
           <w:p>
             <w:r>
-              <w:rPr>
-                <w:sz w:val="18"/>
-              </w:rPr>
-              <w:t>77,439</w:t>
+              <w:t>74,132</w:t>
             </w:r>
           </w:p>
         </w:tc>
@@ -2384,10 +2329,7 @@
           </w:tcPr>
           <w:p>
             <w:r>
-              <w:rPr>
-                <w:sz w:val="18"/>
-              </w:rPr>
-              <w:t>22,126</w:t>
+              <w:t>18,628</w:t>
             </w:r>
           </w:p>
         </w:tc>
@@ -2412,10 +2354,7 @@
           </w:tcPr>
           <w:p>
             <w:r>
-              <w:rPr>
-                <w:sz w:val="18"/>
-              </w:rPr>
-              <w:t>11,063</w:t>
+              <w:t>17,868</w:t>
             </w:r>
           </w:p>
         </w:tc>
@@ -2440,9 +2379,6 @@
           </w:tcPr>
           <w:p>
             <w:r>
-              <w:rPr>
-                <w:sz w:val="18"/>
-              </w:rPr>
               <w:t>61</w:t>
             </w:r>
           </w:p>
@@ -2496,10 +2432,7 @@
           </w:tcPr>
           <w:p>
             <w:r>
-              <w:rPr>
-                <w:sz w:val="18"/>
-              </w:rPr>
-              <w:t>112</w:t>
+              <w:t>103</w:t>
             </w:r>
           </w:p>
         </w:tc>
@@ -2530,10 +2463,29 @@
           </w:tcPr>
           <w:p>
             <w:r>
-              <w:rPr>
-                <w:sz w:val="18"/>
-              </w:rPr>
-              <w:t>176</w:t>
+              <w:t>167</w:t>
+            </w:r>
+          </w:p>
+        </w:tc>
+      </w:tr>
+      <w:tr>
+        <w:tc>
+          <w:tcPr>
+            <w:tcW w:type="dxa" w:w="4968"/>
+          </w:tcPr>
+          <w:p>
+            <w:r>
+              <w:t>数据划分方式</w:t>
+            </w:r>
+          </w:p>
+        </w:tc>
+        <w:tc>
+          <w:tcPr>
+            <w:tcW w:type="dxa" w:w="4968"/>
+          </w:tcPr>
+          <w:p>
+            <w:r>
+              <w:t>按 arrival_date 时间窗口划分：1-8 月训练，9-10 月验证，11-12 月测试</w:t>
             </w:r>
           </w:p>
         </w:tc>
@@ -2616,10 +2568,7 @@
           </w:tcPr>
           <w:p>
             <w:r>
-              <w:rPr>
-                <w:sz w:val="18"/>
-              </w:rPr>
-              <w:t>0.93</w:t>
+              <w:t>0.9307</w:t>
             </w:r>
           </w:p>
         </w:tc>
@@ -2644,10 +2593,7 @@
           </w:tcPr>
           <w:p>
             <w:r>
-              <w:rPr>
-                <w:sz w:val="18"/>
-              </w:rPr>
-              <w:t>0.93</w:t>
+              <w:t>0.9260</w:t>
             </w:r>
           </w:p>
         </w:tc>
@@ -2672,10 +2618,7 @@
           </w:tcPr>
           <w:p>
             <w:r>
-              <w:rPr>
-                <w:sz w:val="18"/>
-              </w:rPr>
-              <w:t>0.93</w:t>
+              <w:t>0.9258</w:t>
             </w:r>
           </w:p>
         </w:tc>
@@ -2880,9 +2823,6 @@
           </w:tcPr>
           <w:p>
             <w:r>
-              <w:rPr>
-                <w:sz w:val="18"/>
-              </w:rPr>
               <w:t>cancellation_risk_score_scaled</w:t>
             </w:r>
           </w:p>
@@ -2893,10 +2833,7 @@
           </w:tcPr>
           <w:p>
             <w:r>
-              <w:rPr>
-                <w:sz w:val="18"/>
-              </w:rPr>
-              <w:t>0.1564</w:t>
+              <w:t>0.1376</w:t>
             </w:r>
           </w:p>
         </w:tc>
@@ -2908,9 +2845,6 @@
           </w:tcPr>
           <w:p>
             <w:r>
-              <w:rPr>
-                <w:sz w:val="18"/>
-              </w:rPr>
               <w:t>deposit_type_Non_Refund</w:t>
             </w:r>
           </w:p>
@@ -2921,10 +2855,7 @@
           </w:tcPr>
           <w:p>
             <w:r>
-              <w:rPr>
-                <w:sz w:val="18"/>
-              </w:rPr>
-              <w:t>0.0719</w:t>
+              <w:t>0.0906</w:t>
             </w:r>
           </w:p>
         </w:tc>
@@ -2936,10 +2867,7 @@
           </w:tcPr>
           <w:p>
             <w:r>
-              <w:rPr>
-                <w:sz w:val="18"/>
-              </w:rPr>
-              <w:t>deposit_type_No_Deposit</w:t>
+              <w:t>country_target_encoded</w:t>
             </w:r>
           </w:p>
         </w:tc>
@@ -2949,10 +2877,7 @@
           </w:tcPr>
           <w:p>
             <w:r>
-              <w:rPr>
-                <w:sz w:val="18"/>
-              </w:rPr>
-              <w:t>0.0702</w:t>
+              <w:t>0.0668</w:t>
             </w:r>
           </w:p>
         </w:tc>
@@ -2964,10 +2889,7 @@
           </w:tcPr>
           <w:p>
             <w:r>
-              <w:rPr>
-                <w:sz w:val="18"/>
-              </w:rPr>
-              <w:t>country_target_encoded</w:t>
+              <w:t>deposit_type_No_Deposit</w:t>
             </w:r>
           </w:p>
         </w:tc>
@@ -2977,10 +2899,7 @@
           </w:tcPr>
           <w:p>
             <w:r>
-              <w:rPr>
-                <w:sz w:val="18"/>
-              </w:rPr>
-              <w:t>0.0577</w:t>
+              <w:t>0.0539</w:t>
             </w:r>
           </w:p>
         </w:tc>
@@ -2992,10 +2911,7 @@
           </w:tcPr>
           <w:p>
             <w:r>
-              <w:rPr>
-                <w:sz w:val="18"/>
-              </w:rPr>
-              <w:t>country_hist_cancel_rate_scaled</w:t>
+              <w:t>agent_target_encoded</w:t>
             </w:r>
           </w:p>
         </w:tc>
@@ -3005,10 +2921,7 @@
           </w:tcPr>
           <w:p>
             <w:r>
-              <w:rPr>
-                <w:sz w:val="18"/>
-              </w:rPr>
-              <w:t>0.0513</w:t>
+              <w:t>0.0502</w:t>
             </w:r>
           </w:p>
         </w:tc>
@@ -3020,10 +2933,7 @@
           </w:tcPr>
           <w:p>
             <w:r>
-              <w:rPr>
-                <w:sz w:val="18"/>
-              </w:rPr>
-              <w:t>agent_target_encoded</w:t>
+              <w:t>country_hist_cancel_rate_scaled</w:t>
             </w:r>
           </w:p>
         </w:tc>
@@ -3033,10 +2943,7 @@
           </w:tcPr>
           <w:p>
             <w:r>
-              <w:rPr>
-                <w:sz w:val="18"/>
-              </w:rPr>
-              <w:t>0.0494</w:t>
+              <w:t>0.0430</w:t>
             </w:r>
           </w:p>
         </w:tc>
@@ -3048,9 +2955,6 @@
           </w:tcPr>
           <w:p>
             <w:r>
-              <w:rPr>
-                <w:sz w:val="18"/>
-              </w:rPr>
               <w:t>agent_hist_cancel_rate_scaled</w:t>
             </w:r>
           </w:p>
@@ -3061,10 +2965,7 @@
           </w:tcPr>
           <w:p>
             <w:r>
-              <w:rPr>
-                <w:sz w:val="18"/>
-              </w:rPr>
-              <w:t>0.0442</w:t>
+              <w:t>0.0427</w:t>
             </w:r>
           </w:p>
         </w:tc>
@@ -3076,9 +2977,6 @@
           </w:tcPr>
           <w:p>
             <w:r>
-              <w:rPr>
-                <w:sz w:val="18"/>
-              </w:rPr>
               <w:t>customer_group_key_target_encoded</w:t>
             </w:r>
           </w:p>
@@ -3089,10 +2987,7 @@
           </w:tcPr>
           <w:p>
             <w:r>
-              <w:rPr>
-                <w:sz w:val="18"/>
-              </w:rPr>
-              <w:t>0.0431</w:t>
+              <w:t>0.0408</w:t>
             </w:r>
           </w:p>
         </w:tc>
@@ -3104,9 +2999,6 @@
           </w:tcPr>
           <w:p>
             <w:r>
-              <w:rPr>
-                <w:sz w:val="18"/>
-              </w:rPr>
               <w:t>lead_time_scaled</w:t>
             </w:r>
           </w:p>
@@ -3117,10 +3009,7 @@
           </w:tcPr>
           <w:p>
             <w:r>
-              <w:rPr>
-                <w:sz w:val="18"/>
-              </w:rPr>
-              <w:t>0.0330</w:t>
+              <w:t>0.0363</w:t>
             </w:r>
           </w:p>
         </w:tc>
@@ -3132,10 +3021,7 @@
           </w:tcPr>
           <w:p>
             <w:r>
-              <w:rPr>
-                <w:sz w:val="18"/>
-              </w:rPr>
-              <w:t>room_type_matched_scaled</w:t>
+              <w:t>lead_time_group_0_7</w:t>
             </w:r>
           </w:p>
         </w:tc>
@@ -3145,10 +3031,7 @@
           </w:tcPr>
           <w:p>
             <w:r>
-              <w:rPr>
-                <w:sz w:val="18"/>
-              </w:rPr>
-              <w:t>0.0324</w:t>
+              <w:t>0.0360</w:t>
             </w:r>
           </w:p>
         </w:tc>

</xml_diff>